<commit_message>
Maknut placeholder za Programske jezike
</commit_message>
<xml_diff>
--- a/Dokumentacija.docx
+++ b/Dokumentacija.docx
@@ -56000,14 +56000,6 @@
     </w:p>
     <w:p>
       <w:pPr>
-        <w:pStyle w:val="Blokteksta"/>
-      </w:pPr>
-      <w:r>
-        <w:t>Navesti korištene jezike i njihove verzije (npr. JavaScript 16.13).</w:t>
-      </w:r>
-    </w:p>
-    <w:p>
-      <w:pPr>
         <w:pStyle w:val="Naslov2"/>
       </w:pPr>
       <w:bookmarkStart w:id="298" w:name="_Toc219742515"/>
@@ -56202,7 +56194,6 @@
         </w:numPr>
       </w:pPr>
       <w:r>
-        <w:lastRenderedPageBreak/>
         <w:t>Node.js: Verzija 18 ili novija (za frontend).</w:t>
       </w:r>
     </w:p>
@@ -56215,6 +56206,7 @@
         </w:numPr>
       </w:pPr>
       <w:r>
+        <w:lastRenderedPageBreak/>
         <w:t>Docker Desktop: Najnovija verzija (za izgradnju kontejnera).</w:t>
       </w:r>
     </w:p>
@@ -56533,17 +56525,224 @@
         <w:rPr>
           <w:rStyle w:val="VerbatimChar"/>
         </w:rPr>
+        <w:t>SUPABASE_S3_BUCKET=units</w:t>
+      </w:r>
+      <w:r>
+        <w:br/>
+      </w:r>
+      <w:r>
+        <w:rPr>
+          <w:rStyle w:val="VerbatimChar"/>
+        </w:rPr>
+        <w:t>SUPABASE_S3_REGION=eu-central-1</w:t>
+      </w:r>
+    </w:p>
+    <w:p>
+      <w:pPr>
+        <w:pStyle w:val="FirstParagraph"/>
+      </w:pPr>
+      <w:r>
         <w:lastRenderedPageBreak/>
-        <w:t>SUPABASE_S3_BUCKET=units</w:t>
-      </w:r>
-      <w:r>
-        <w:br/>
+        <w:t>Ova datoteka služi kao lokalno spremište varijabli okruženja. Ona sadrži konkretne, često povjerljive vrijednosti koje se ne bi trebale dijeliti. - Baza podataka: Definira parametre za spajanje na Supabase PostgreSQL bazu (</w:t>
       </w:r>
       <w:r>
         <w:rPr>
           <w:rStyle w:val="VerbatimChar"/>
         </w:rPr>
-        <w:t>SUPABASE_S3_REGION=eu-central-1</w:t>
+        <w:t>URL</w:t>
+      </w:r>
+      <w:r>
+        <w:t xml:space="preserve">, </w:t>
+      </w:r>
+      <w:r>
+        <w:rPr>
+          <w:rStyle w:val="VerbatimChar"/>
+        </w:rPr>
+        <w:t>USER</w:t>
+      </w:r>
+      <w:r>
+        <w:t xml:space="preserve">, </w:t>
+      </w:r>
+      <w:r>
+        <w:rPr>
+          <w:rStyle w:val="VerbatimChar"/>
+        </w:rPr>
+        <w:t>PASSWORD</w:t>
+      </w:r>
+      <w:r>
+        <w:t>). - FRONTEND_URL: Određuje adresu s koje dolazi frontend (npr. React na portu 3000), što je ključno za rješavanje CORS sigurnosnih pravila. - Email postavke: Sadrži vjerodajnice za Gmail SMTP poslužitelj kako bi aplikacija mogla slati automatske poruke. - Supabase Storage (S3): Ovdje su pohranjeni pristupni ključevi i putanje za rad sa slikama. Sustav koristi S3 protokol, što je standard za pohranu objekata u Cloudu.</w:t>
+      </w:r>
+    </w:p>
+    <w:p>
+      <w:pPr>
+        <w:pStyle w:val="Tijeloteksta"/>
+      </w:pPr>
+      <w:r>
+        <w:t>Sadržaj application.properties datoteke:</w:t>
+      </w:r>
+    </w:p>
+    <w:p>
+      <w:pPr>
+        <w:pStyle w:val="SourceCode"/>
+      </w:pPr>
+      <w:r>
+        <w:rPr>
+          <w:rStyle w:val="VerbatimChar"/>
+        </w:rPr>
+        <w:t>spring.application.name=backend</w:t>
+      </w:r>
+      <w:r>
+        <w:br/>
+      </w:r>
+      <w:r>
+        <w:br/>
+      </w:r>
+      <w:r>
+        <w:rPr>
+          <w:rStyle w:val="VerbatimChar"/>
+        </w:rPr>
+        <w:t>spring.datasource.url=${DATASOURCE_URL}</w:t>
+      </w:r>
+      <w:r>
+        <w:br/>
+      </w:r>
+      <w:r>
+        <w:rPr>
+          <w:rStyle w:val="VerbatimChar"/>
+        </w:rPr>
+        <w:t>spring.datasource.username=${DATASOURCE_USER}</w:t>
+      </w:r>
+      <w:r>
+        <w:br/>
+      </w:r>
+      <w:r>
+        <w:rPr>
+          <w:rStyle w:val="VerbatimChar"/>
+        </w:rPr>
+        <w:t>spring.datasource.password=${DATASOURCE_PASSWORD}</w:t>
+      </w:r>
+      <w:r>
+        <w:br/>
+      </w:r>
+      <w:r>
+        <w:br/>
+      </w:r>
+      <w:r>
+        <w:rPr>
+          <w:rStyle w:val="VerbatimChar"/>
+        </w:rPr>
+        <w:t>spring.jpa.properties.hibernate.dialect=org.hibernate.dialect.PostgreSQLDialect</w:t>
+      </w:r>
+      <w:r>
+        <w:br/>
+      </w:r>
+      <w:r>
+        <w:rPr>
+          <w:rStyle w:val="VerbatimChar"/>
+        </w:rPr>
+        <w:t>spring.jpa.hibernate.ddl-auto=update</w:t>
+      </w:r>
+      <w:r>
+        <w:br/>
+      </w:r>
+      <w:r>
+        <w:br/>
+      </w:r>
+      <w:r>
+        <w:rPr>
+          <w:rStyle w:val="VerbatimChar"/>
+        </w:rPr>
+        <w:t>frontend.url=${FRONTEND_URL}</w:t>
+      </w:r>
+      <w:r>
+        <w:br/>
+      </w:r>
+      <w:r>
+        <w:br/>
+      </w:r>
+      <w:r>
+        <w:rPr>
+          <w:rStyle w:val="VerbatimChar"/>
+        </w:rPr>
+        <w:t>spring.security.oauth2.resourceserver.jwt.issuer-uri=https://accounts.google.com</w:t>
+      </w:r>
+      <w:r>
+        <w:br/>
+      </w:r>
+      <w:r>
+        <w:br/>
+      </w:r>
+      <w:r>
+        <w:rPr>
+          <w:rStyle w:val="VerbatimChar"/>
+        </w:rPr>
+        <w:t>spring.servlet.multipart.max-file-size=10MB</w:t>
+      </w:r>
+      <w:r>
+        <w:br/>
+      </w:r>
+      <w:r>
+        <w:rPr>
+          <w:rStyle w:val="VerbatimChar"/>
+        </w:rPr>
+        <w:t>spring.servlet.multipart.max-request-size=10MB</w:t>
+      </w:r>
+      <w:r>
+        <w:br/>
+      </w:r>
+      <w:r>
+        <w:br/>
+      </w:r>
+      <w:r>
+        <w:rPr>
+          <w:rStyle w:val="VerbatimChar"/>
+        </w:rPr>
+        <w:t># Supabase S3</w:t>
+      </w:r>
+      <w:r>
+        <w:br/>
+      </w:r>
+      <w:r>
+        <w:rPr>
+          <w:rStyle w:val="VerbatimChar"/>
+        </w:rPr>
+        <w:t>supabase.s3.access-key=${SUPABASE_S3_ACCESS_KEY}</w:t>
+      </w:r>
+      <w:r>
+        <w:br/>
+      </w:r>
+      <w:r>
+        <w:rPr>
+          <w:rStyle w:val="VerbatimChar"/>
+        </w:rPr>
+        <w:t>supabase.s3.secret-key=${SUPABASE_S3_SECRET_KEY}</w:t>
+      </w:r>
+      <w:r>
+        <w:br/>
+      </w:r>
+      <w:r>
+        <w:rPr>
+          <w:rStyle w:val="VerbatimChar"/>
+        </w:rPr>
+        <w:t>supabase.s3.endpoint=${SUPABASE_S3_ENDPOINT}</w:t>
+      </w:r>
+      <w:r>
+        <w:br/>
+      </w:r>
+      <w:r>
+        <w:rPr>
+          <w:rStyle w:val="VerbatimChar"/>
+        </w:rPr>
+        <w:t>supabase.s3.bucket=${SUPABASE_S3_BUCKET:units}</w:t>
+      </w:r>
+      <w:r>
+        <w:br/>
+      </w:r>
+      <w:r>
+        <w:rPr>
+          <w:rStyle w:val="VerbatimChar"/>
+        </w:rPr>
+        <w:t>supabase.s3.region=${SUPABASE_S3_REGION:eu-central-1}</w:t>
       </w:r>
     </w:p>
     <w:p>
@@ -56551,272 +56750,65 @@
         <w:pStyle w:val="FirstParagraph"/>
       </w:pPr>
       <w:r>
-        <w:t>Ova datoteka služi kao lokalno spremište varijabli okruženja. Ona sadrži konkretne, često povjerljive vrijednosti koje se ne bi trebale dijeliti. - Baza podataka: Definira parametre za spajanje na Supabase PostgreSQL bazu (</w:t>
+        <w:t xml:space="preserve">Ovo je glavna konfiguracijska datoteka Spring Boota. Ona ne sadrži izravne lozinke, već koristi sintaksu </w:t>
       </w:r>
       <w:r>
         <w:rPr>
           <w:rStyle w:val="VerbatimChar"/>
         </w:rPr>
-        <w:t>URL</w:t>
-      </w:r>
-      <w:r>
-        <w:t xml:space="preserve">, </w:t>
+        <w:t>${IME_VARIJABLE}</w:t>
+      </w:r>
+      <w:r>
+        <w:t xml:space="preserve"> kako bi povukla vrijednosti definirane u </w:t>
       </w:r>
       <w:r>
         <w:rPr>
           <w:rStyle w:val="VerbatimChar"/>
         </w:rPr>
-        <w:t>USER</w:t>
-      </w:r>
-      <w:r>
-        <w:t xml:space="preserve">, </w:t>
+        <w:t>.env</w:t>
+      </w:r>
+      <w:r>
+        <w:t xml:space="preserve"> datoteci ili na samom poslužitelju. Povezivanje baze podataka: Putem </w:t>
       </w:r>
       <w:r>
         <w:rPr>
           <w:rStyle w:val="VerbatimChar"/>
         </w:rPr>
-        <w:t>PASSWORD</w:t>
-      </w:r>
-      <w:r>
-        <w:t>). - FRONTEND_URL: Određuje adresu s koje dolazi frontend (npr. React na portu 3000), što je ključno za rješavanje CORS sigurnosnih pravila. - Email postavke: Sadrži vjerodajnice za Gmail SMTP poslužitelj kako bi aplikacija mogla slati automatske poruke. - Supabase Storage (S3): Ovdje su pohranjeni pristupni ključevi i putanje za rad sa slikama. Sustav koristi S3 protokol, što je standard za pohranu objekata u Cloudu.</w:t>
-      </w:r>
-    </w:p>
-    <w:p>
-      <w:pPr>
-        <w:pStyle w:val="Tijeloteksta"/>
-      </w:pPr>
-      <w:r>
-        <w:t>Sadržaj application.properties datoteke:</w:t>
-      </w:r>
-    </w:p>
-    <w:p>
-      <w:pPr>
-        <w:pStyle w:val="SourceCode"/>
-      </w:pPr>
+        <w:t>spring.datasource</w:t>
+      </w:r>
+      <w:r>
+        <w:t xml:space="preserve"> parametara, Spring preuzima podatke iz </w:t>
+      </w:r>
       <w:r>
         <w:rPr>
           <w:rStyle w:val="VerbatimChar"/>
         </w:rPr>
-        <w:t>spring.application.name=backend</w:t>
-      </w:r>
-      <w:r>
-        <w:br/>
-      </w:r>
-      <w:r>
-        <w:br/>
+        <w:t>.env</w:t>
+      </w:r>
+      <w:r>
+        <w:t xml:space="preserve"> datoteke i uspostavlja vezu s bazom. - Hibernate postavke: * </w:t>
       </w:r>
       <w:r>
         <w:rPr>
           <w:rStyle w:val="VerbatimChar"/>
         </w:rPr>
-        <w:t>spring.datasource.url=${DATASOURCE_URL}</w:t>
-      </w:r>
-      <w:r>
-        <w:br/>
+        <w:t>dialect</w:t>
+      </w:r>
+      <w:r>
+        <w:t xml:space="preserve">: Govori Hibernateu da koristi specifična pravila za PostgreSQL. - ddl-auto=update: Automatski ažurira strukturu tablica u bazi prema promjenama u Java entitetima. - OAuth2 / Google Login: </w:t>
       </w:r>
       <w:r>
         <w:rPr>
           <w:rStyle w:val="VerbatimChar"/>
         </w:rPr>
-        <w:t>spring.datasource.username=${DATASOURCE_USER}</w:t>
-      </w:r>
-      <w:r>
-        <w:br/>
-      </w:r>
-      <w:r>
-        <w:rPr>
-          <w:rStyle w:val="VerbatimChar"/>
-        </w:rPr>
-        <w:t>spring.datasource.password=${DATASOURCE_PASSWORD}</w:t>
-      </w:r>
-      <w:r>
-        <w:br/>
-      </w:r>
-      <w:r>
-        <w:br/>
-      </w:r>
-      <w:r>
-        <w:rPr>
-          <w:rStyle w:val="VerbatimChar"/>
-        </w:rPr>
-        <w:t>spring.jpa.properties.hibernate.dialect=org.hibernate.dialect.PostgreSQLDialect</w:t>
-      </w:r>
-      <w:r>
-        <w:br/>
-      </w:r>
-      <w:r>
-        <w:rPr>
-          <w:rStyle w:val="VerbatimChar"/>
-        </w:rPr>
-        <w:t>spring.jpa.hibernate.ddl-auto=update</w:t>
-      </w:r>
-      <w:r>
-        <w:br/>
-      </w:r>
-      <w:r>
-        <w:br/>
-      </w:r>
-      <w:r>
-        <w:rPr>
-          <w:rStyle w:val="VerbatimChar"/>
-        </w:rPr>
-        <w:t>frontend.url=${FRONTEND_URL}</w:t>
-      </w:r>
-      <w:r>
-        <w:br/>
-      </w:r>
-      <w:r>
-        <w:br/>
-      </w:r>
-      <w:r>
-        <w:rPr>
-          <w:rStyle w:val="VerbatimChar"/>
-        </w:rPr>
-        <w:t>spring.security.oauth2.resourceserver.jwt.issuer-uri=https://accounts.google.com</w:t>
-      </w:r>
-      <w:r>
-        <w:br/>
-      </w:r>
-      <w:r>
-        <w:br/>
-      </w:r>
-      <w:r>
-        <w:rPr>
-          <w:rStyle w:val="VerbatimChar"/>
-        </w:rPr>
-        <w:t>spring.servlet.multipart.max-file-size=10MB</w:t>
-      </w:r>
-      <w:r>
-        <w:br/>
-      </w:r>
-      <w:r>
-        <w:rPr>
-          <w:rStyle w:val="VerbatimChar"/>
-        </w:rPr>
-        <w:t>spring.servlet.multipart.max-request-size=10MB</w:t>
-      </w:r>
-      <w:r>
-        <w:br/>
-      </w:r>
-      <w:r>
-        <w:br/>
-      </w:r>
-      <w:r>
-        <w:rPr>
-          <w:rStyle w:val="VerbatimChar"/>
-        </w:rPr>
-        <w:t># Supabase S3</w:t>
-      </w:r>
-      <w:r>
-        <w:br/>
-      </w:r>
-      <w:r>
-        <w:rPr>
-          <w:rStyle w:val="VerbatimChar"/>
-        </w:rPr>
-        <w:t>supabase.s3.access-key=${SUPABASE_S3_ACCESS_KEY}</w:t>
-      </w:r>
-      <w:r>
-        <w:br/>
-      </w:r>
-      <w:r>
-        <w:rPr>
-          <w:rStyle w:val="VerbatimChar"/>
-        </w:rPr>
-        <w:t>supabase.s3.secret-key=${SUPABASE_S3_SECRET_KEY}</w:t>
-      </w:r>
-      <w:r>
-        <w:br/>
-      </w:r>
-      <w:r>
-        <w:rPr>
-          <w:rStyle w:val="VerbatimChar"/>
-        </w:rPr>
-        <w:t>supabase.s3.endpoint=${SUPABASE_S3_ENDPOINT}</w:t>
-      </w:r>
-      <w:r>
-        <w:br/>
-      </w:r>
-      <w:r>
-        <w:rPr>
-          <w:rStyle w:val="VerbatimChar"/>
-        </w:rPr>
-        <w:t>supabase.s3.bucket=${SUPABASE_S3_BUCKET:units}</w:t>
-      </w:r>
-      <w:r>
-        <w:br/>
-      </w:r>
-      <w:r>
-        <w:rPr>
-          <w:rStyle w:val="VerbatimChar"/>
-        </w:rPr>
-        <w:t>supabase.s3.region=${SUPABASE_S3_REGION:eu-central-1}</w:t>
-      </w:r>
-    </w:p>
-    <w:p>
-      <w:pPr>
-        <w:pStyle w:val="FirstParagraph"/>
-      </w:pPr>
-      <w:r>
-        <w:t xml:space="preserve">Ovo je glavna konfiguracijska datoteka Spring Boota. Ona ne sadrži izravne lozinke, već koristi sintaksu </w:t>
-      </w:r>
-      <w:r>
-        <w:rPr>
-          <w:rStyle w:val="VerbatimChar"/>
-        </w:rPr>
-        <w:t>${IME_VARIJABLE}</w:t>
-      </w:r>
-      <w:r>
-        <w:t xml:space="preserve"> kako bi povukla vrijednosti definirane u </w:t>
-      </w:r>
-      <w:r>
-        <w:rPr>
-          <w:rStyle w:val="VerbatimChar"/>
-        </w:rPr>
-        <w:t>.env</w:t>
-      </w:r>
-      <w:r>
-        <w:t xml:space="preserve"> datoteci ili na samom poslužitelju. Povezivanje baze podataka: Putem </w:t>
-      </w:r>
-      <w:r>
-        <w:rPr>
-          <w:rStyle w:val="VerbatimChar"/>
-        </w:rPr>
-        <w:t>spring.datasource</w:t>
-      </w:r>
-      <w:r>
-        <w:t xml:space="preserve"> parametara, Spring preuzima podatke iz </w:t>
-      </w:r>
-      <w:r>
-        <w:rPr>
-          <w:rStyle w:val="VerbatimChar"/>
-        </w:rPr>
-        <w:t>.env</w:t>
-      </w:r>
-      <w:r>
-        <w:t xml:space="preserve"> datoteke i uspostavlja vezu s bazom. - Hibernate postavke: * </w:t>
-      </w:r>
-      <w:r>
-        <w:rPr>
-          <w:rStyle w:val="VerbatimChar"/>
-        </w:rPr>
-        <w:t>dialect</w:t>
-      </w:r>
-      <w:r>
-        <w:t xml:space="preserve">: Govori Hibernateu da koristi specifična pravila za PostgreSQL. - ddl-auto=update: Automatski ažurira strukturu tablica u bazi prema promjenama u Java entitetima. - OAuth2 / Google Login: </w:t>
-      </w:r>
-      <w:r>
-        <w:rPr>
-          <w:rStyle w:val="VerbatimChar"/>
-        </w:rPr>
         <w:t>issuer-uri</w:t>
       </w:r>
       <w:r>
-        <w:t xml:space="preserve"> postavlja Google kao autoritet za provjeru autentičnosti putem JWT tokena. - Multipart (Slike): Ograničava veličinu datoteka koje se šalju na poslužitelj (ovdje na 10MB), što sprječava preopterećenje </w:t>
+        <w:t xml:space="preserve"> postavlja Google kao autoritet za provjeru autentičnosti putem JWT tokena. - Multipart (Slike): Ograničava veličinu datoteka koje se šalju na poslužitelj (ovdje na 10MB), što sprječava preopterećenje memorije. - Mapiranje S3 varijabli: Spring preuzima S3 ključeve i prosljeđuje ih internim </w:t>
       </w:r>
       <w:r>
         <w:lastRenderedPageBreak/>
-        <w:t xml:space="preserve">memorije. - Mapiranje S3 varijabli: Spring preuzima S3 ključeve i prosljeđuje ih internim servisima koji upravljaju uploadom slika. Primijeti sintaksu </w:t>
+        <w:t xml:space="preserve">servisima koji upravljaju uploadom slika. Primijeti sintaksu </w:t>
       </w:r>
       <w:r>
         <w:rPr>

</xml_diff>

<commit_message>
Izbrisan template za Alati za ispitivanje
</commit_message>
<xml_diff>
--- a/Dokumentacija.docx
+++ b/Dokumentacija.docx
@@ -56672,14 +56672,6 @@
         <w:t>5. Alati za ispitivanje</w:t>
       </w:r>
       <w:bookmarkEnd w:id="304"/>
-    </w:p>
-    <w:p>
-      <w:pPr>
-        <w:pStyle w:val="Blokteksta"/>
-      </w:pPr>
-      <w:r>
-        <w:t>Jedinični, integracijski ili UI ispitni sljučajevi (npr. Jest 27, Selenium 4.0).</w:t>
-      </w:r>
     </w:p>
     <w:p>
       <w:pPr>
@@ -68287,6 +68279,7 @@
   <w:style w:type="character" w:default="1" w:styleId="Zadanifontodlomka">
     <w:name w:val="Default Paragraph Font"/>
     <w:uiPriority w:val="1"/>
+    <w:semiHidden/>
     <w:unhideWhenUsed/>
   </w:style>
   <w:style w:type="table" w:default="1" w:styleId="Obinatablica">

</xml_diff>